<commit_message>
bwt - gesamtsumme fix docx
</commit_message>
<xml_diff>
--- a/src/templates/Angebot-BWT.docx
+++ b/src/templates/Angebot-BWT.docx
@@ -16,19 +16,15 @@
       </w:pPr>
       <w:r>
         <w:rPr>
-          <w:rFonts w:eastAsia="Arial" w:cs="Arial" w:ascii="Arial" w:hAnsi="Arial"/>
-          <w:b/>
-          <w:bCs/>
-          <w:color w:val="000000"/>
-          <w:sz w:val="24"/>
-          <w:szCs w:val="24"/>
-        </w:rPr>
-      </w:r>
-      <w:r>
+          <w:rFonts w:eastAsia="Open Sans" w:cs="Open Sans" w:ascii="Open Sans" w:hAnsi="Open Sans"/>
+          <w:color w:val="070707"/>
+          <w:sz w:val="17"/>
+          <w:szCs w:val="17"/>
+        </w:rPr>
         <mc:AlternateContent>
           <mc:Choice Requires="wps">
             <w:drawing>
-              <wp:anchor behindDoc="0" distT="72390" distB="72390" distL="72390" distR="72390" simplePos="0" locked="0" layoutInCell="0" allowOverlap="1" relativeHeight="5">
+              <wp:anchor behindDoc="0" distT="72390" distB="72390" distL="71755" distR="72390" simplePos="0" locked="0" layoutInCell="0" allowOverlap="1" relativeHeight="5">
                 <wp:simplePos x="0" y="0"/>
                 <wp:positionH relativeFrom="page">
                   <wp:posOffset>720090</wp:posOffset>
@@ -43,17 +39,28 @@
                 <a:graphic xmlns:a="http://schemas.openxmlformats.org/drawingml/2006/main">
                   <a:graphicData uri="http://schemas.microsoft.com/office/word/2010/wordprocessingShape">
                     <wps:wsp>
-                      <wps:cNvSpPr txBox="1"/>
+                      <wps:cNvSpPr/>
                       <wps:spPr>
                         <a:xfrm>
                           <a:off x="0" y="0"/>
-                          <a:ext cx="6332855" cy="2288540"/>
+                          <a:ext cx="6332760" cy="2288520"/>
                         </a:xfrm>
-                        <a:prstGeom prst="rect"/>
+                        <a:prstGeom prst="rect">
+                          <a:avLst/>
+                        </a:prstGeom>
                         <a:solidFill>
-                          <a:srgbClr val="FFFFFF"/>
+                          <a:srgbClr val="ffffff"/>
                         </a:solidFill>
+                        <a:ln w="0">
+                          <a:noFill/>
+                        </a:ln>
                       </wps:spPr>
+                      <wps:style>
+                        <a:lnRef idx="0"/>
+                        <a:fillRef idx="0"/>
+                        <a:effectRef idx="0"/>
+                        <a:fontRef idx="minor"/>
+                      </wps:style>
                       <wps:txbx>
                         <w:txbxContent>
                           <w:p>
@@ -123,8 +130,8 @@
                               <w:tblLook w:val="04a0" w:noVBand="1" w:noHBand="0" w:lastColumn="0" w:firstColumn="1" w:lastRow="0" w:firstRow="1"/>
                             </w:tblPr>
                             <w:tblGrid>
-                              <w:gridCol w:w="4799"/>
-                              <w:gridCol w:w="2401"/>
+                              <w:gridCol w:w="4798"/>
+                              <w:gridCol w:w="2402"/>
                               <w:gridCol w:w="2835"/>
                             </w:tblGrid>
                             <w:tr>
@@ -133,7 +140,7 @@
                               </w:trPr>
                               <w:tc>
                                 <w:tcPr>
-                                  <w:tcW w:w="4799" w:type="dxa"/>
+                                  <w:tcW w:w="4798" w:type="dxa"/>
                                   <w:tcBorders>
                                     <w:top w:val="single" w:sz="8" w:space="0" w:color="FFFFFF"/>
                                     <w:left w:val="single" w:sz="8" w:space="0" w:color="FFFFFF"/>
@@ -237,7 +244,7 @@
                               </w:tc>
                               <w:tc>
                                 <w:tcPr>
-                                  <w:tcW w:w="2401" w:type="dxa"/>
+                                  <w:tcW w:w="2402" w:type="dxa"/>
                                   <w:tcBorders>
                                     <w:top w:val="single" w:sz="8" w:space="0" w:color="FFFFFF"/>
                                     <w:left w:val="single" w:sz="8" w:space="0" w:color="FFFFFF"/>
@@ -628,17 +635,12 @@
                               </w:rPr>
                             </w:pPr>
                             <w:r>
-                              <w:rPr>
-                                <w:rFonts w:eastAsia="Open Sans" w:cs="Open Sans" w:ascii="Open Sans" w:hAnsi="Open Sans"/>
-                                <w:color w:val="070707"/>
-                                <w:sz w:val="17"/>
-                                <w:szCs w:val="17"/>
-                              </w:rPr>
+                              <w:rPr/>
                             </w:r>
                           </w:p>
                         </w:txbxContent>
                       </wps:txbx>
-                      <wps:bodyPr anchor="t" lIns="0" tIns="0" rIns="0" bIns="0">
+                      <wps:bodyPr lIns="0" rIns="0" tIns="0" bIns="0" anchor="t">
                         <a:noAutofit/>
                       </wps:bodyPr>
                     </wps:wsp>
@@ -649,8 +651,10 @@
           </mc:Choice>
           <mc:Fallback>
             <w:pict>
-              <v:rect style="position:absolute;rotation:-0;width:498.65pt;height:180.2pt;mso-wrap-distance-left:5.7pt;mso-wrap-distance-right:5.7pt;mso-wrap-distance-top:5.7pt;mso-wrap-distance-bottom:5.7pt;margin-top:116.2pt;mso-position-vertical-relative:page;margin-left:56.7pt;mso-position-horizontal-relative:page">
-                <v:textbox inset="0in,0in,0in,0in">
+              <v:rect id="shape_0" ID="Frame1" path="m0,0l-2147483645,0l-2147483645,-2147483646l0,-2147483646xe" fillcolor="white" stroked="f" o:allowincell="f" style="position:absolute;margin-left:56.7pt;margin-top:116.2pt;width:498.6pt;height:180.15pt;mso-wrap-style:square;v-text-anchor:top;mso-position-horizontal-relative:page;mso-position-vertical-relative:page">
+                <v:fill o:detectmouseclick="t" type="solid" color2="black"/>
+                <v:stroke color="#3465a4" joinstyle="round" endcap="flat"/>
+                <v:textbox>
                   <w:txbxContent>
                     <w:p>
                       <w:pPr>
@@ -719,8 +723,8 @@
                         <w:tblLook w:val="04a0" w:noVBand="1" w:noHBand="0" w:lastColumn="0" w:firstColumn="1" w:lastRow="0" w:firstRow="1"/>
                       </w:tblPr>
                       <w:tblGrid>
-                        <w:gridCol w:w="4799"/>
-                        <w:gridCol w:w="2401"/>
+                        <w:gridCol w:w="4798"/>
+                        <w:gridCol w:w="2402"/>
                         <w:gridCol w:w="2835"/>
                       </w:tblGrid>
                       <w:tr>
@@ -729,7 +733,7 @@
                         </w:trPr>
                         <w:tc>
                           <w:tcPr>
-                            <w:tcW w:w="4799" w:type="dxa"/>
+                            <w:tcW w:w="4798" w:type="dxa"/>
                             <w:tcBorders>
                               <w:top w:val="single" w:sz="8" w:space="0" w:color="FFFFFF"/>
                               <w:left w:val="single" w:sz="8" w:space="0" w:color="FFFFFF"/>
@@ -833,7 +837,7 @@
                         </w:tc>
                         <w:tc>
                           <w:tcPr>
-                            <w:tcW w:w="2401" w:type="dxa"/>
+                            <w:tcW w:w="2402" w:type="dxa"/>
                             <w:tcBorders>
                               <w:top w:val="single" w:sz="8" w:space="0" w:color="FFFFFF"/>
                               <w:left w:val="single" w:sz="8" w:space="0" w:color="FFFFFF"/>
@@ -1224,12 +1228,7 @@
                         </w:rPr>
                       </w:pPr>
                       <w:r>
-                        <w:rPr>
-                          <w:rFonts w:eastAsia="Open Sans" w:cs="Open Sans" w:ascii="Open Sans" w:hAnsi="Open Sans"/>
-                          <w:color w:val="070707"/>
-                          <w:sz w:val="17"/>
-                          <w:szCs w:val="17"/>
-                        </w:rPr>
+                        <w:rPr/>
                       </w:r>
                     </w:p>
                   </w:txbxContent>
@@ -1359,8 +1358,8 @@
       </w:tblPr>
       <w:tblGrid>
         <w:gridCol w:w="479"/>
-        <w:gridCol w:w="830"/>
-        <w:gridCol w:w="5501"/>
+        <w:gridCol w:w="829"/>
+        <w:gridCol w:w="5502"/>
         <w:gridCol w:w="1352"/>
         <w:gridCol w:w="1181"/>
       </w:tblGrid>
@@ -1403,7 +1402,7 @@
         </w:tc>
         <w:tc>
           <w:tcPr>
-            <w:tcW w:w="830" w:type="dxa"/>
+            <w:tcW w:w="829" w:type="dxa"/>
             <w:tcBorders/>
             <w:shd w:color="auto" w:fill="CCCCCC" w:val="clear"/>
           </w:tcPr>
@@ -1436,7 +1435,7 @@
         </w:tc>
         <w:tc>
           <w:tcPr>
-            <w:tcW w:w="5501" w:type="dxa"/>
+            <w:tcW w:w="5502" w:type="dxa"/>
             <w:tcBorders/>
             <w:shd w:color="auto" w:fill="CCCCCC" w:val="clear"/>
           </w:tcPr>
@@ -1559,7 +1558,7 @@
         </w:tc>
         <w:tc>
           <w:tcPr>
-            <w:tcW w:w="830" w:type="dxa"/>
+            <w:tcW w:w="829" w:type="dxa"/>
             <w:tcBorders/>
             <w:shd w:color="auto" w:fill="FFFFFF" w:val="clear"/>
           </w:tcPr>
@@ -1590,7 +1589,7 @@
         </w:tc>
         <w:tc>
           <w:tcPr>
-            <w:tcW w:w="5501" w:type="dxa"/>
+            <w:tcW w:w="5502" w:type="dxa"/>
             <w:tcBorders/>
             <w:shd w:color="auto" w:fill="FFFFFF" w:val="clear"/>
           </w:tcPr>
@@ -1743,7 +1742,7 @@
         </w:tc>
         <w:tc>
           <w:tcPr>
-            <w:tcW w:w="830" w:type="dxa"/>
+            <w:tcW w:w="829" w:type="dxa"/>
             <w:tcBorders/>
             <w:shd w:color="auto" w:fill="FFFFFF" w:val="clear"/>
             <w:tcMar>
@@ -1772,7 +1771,7 @@
         </w:tc>
         <w:tc>
           <w:tcPr>
-            <w:tcW w:w="5501" w:type="dxa"/>
+            <w:tcW w:w="5502" w:type="dxa"/>
             <w:tcBorders/>
             <w:shd w:color="auto" w:fill="FFFFFF" w:val="clear"/>
             <w:tcMar>
@@ -2133,8 +2132,8 @@
       </w:tblPr>
       <w:tblGrid>
         <w:gridCol w:w="479"/>
-        <w:gridCol w:w="830"/>
-        <w:gridCol w:w="5501"/>
+        <w:gridCol w:w="829"/>
+        <w:gridCol w:w="5502"/>
         <w:gridCol w:w="1352"/>
         <w:gridCol w:w="1181"/>
       </w:tblGrid>
@@ -2174,7 +2173,7 @@
         </w:tc>
         <w:tc>
           <w:tcPr>
-            <w:tcW w:w="830" w:type="dxa"/>
+            <w:tcW w:w="829" w:type="dxa"/>
             <w:tcBorders/>
             <w:shd w:color="auto" w:fill="FFFFFF" w:val="clear"/>
           </w:tcPr>
@@ -2205,7 +2204,7 @@
         </w:tc>
         <w:tc>
           <w:tcPr>
-            <w:tcW w:w="5501" w:type="dxa"/>
+            <w:tcW w:w="5502" w:type="dxa"/>
             <w:tcBorders/>
             <w:shd w:color="auto" w:fill="FFFFFF" w:val="clear"/>
           </w:tcPr>
@@ -2340,7 +2339,7 @@
         </w:tc>
         <w:tc>
           <w:tcPr>
-            <w:tcW w:w="830" w:type="dxa"/>
+            <w:tcW w:w="829" w:type="dxa"/>
             <w:tcBorders/>
             <w:shd w:color="auto" w:fill="FFFFFF" w:val="clear"/>
           </w:tcPr>
@@ -2365,7 +2364,7 @@
         </w:tc>
         <w:tc>
           <w:tcPr>
-            <w:tcW w:w="5501" w:type="dxa"/>
+            <w:tcW w:w="5502" w:type="dxa"/>
             <w:tcBorders/>
             <w:shd w:color="auto" w:fill="FFFFFF" w:val="clear"/>
           </w:tcPr>
@@ -2621,7 +2620,7 @@
         </w:tc>
         <w:tc>
           <w:tcPr>
-            <w:tcW w:w="830" w:type="dxa"/>
+            <w:tcW w:w="829" w:type="dxa"/>
             <w:tcBorders/>
             <w:shd w:color="auto" w:fill="FFFFFF" w:val="clear"/>
           </w:tcPr>
@@ -2653,7 +2652,7 @@
         </w:tc>
         <w:tc>
           <w:tcPr>
-            <w:tcW w:w="5501" w:type="dxa"/>
+            <w:tcW w:w="5502" w:type="dxa"/>
             <w:tcBorders/>
             <w:shd w:color="auto" w:fill="FFFFFF" w:val="clear"/>
           </w:tcPr>
@@ -2813,8 +2812,8 @@
         <w:tblLook w:val="04a0" w:noVBand="1" w:noHBand="0" w:lastColumn="0" w:firstColumn="1" w:lastRow="0" w:firstRow="1"/>
       </w:tblPr>
       <w:tblGrid>
-        <w:gridCol w:w="6748"/>
-        <w:gridCol w:w="2594"/>
+        <w:gridCol w:w="4253"/>
+        <w:gridCol w:w="5089"/>
       </w:tblGrid>
       <w:tr>
         <w:trPr>
@@ -2822,7 +2821,7 @@
         </w:trPr>
         <w:tc>
           <w:tcPr>
-            <w:tcW w:w="6748" w:type="dxa"/>
+            <w:tcW w:w="4253" w:type="dxa"/>
             <w:tcBorders/>
             <w:shd w:color="auto" w:fill="CCCCCC" w:val="clear"/>
           </w:tcPr>
@@ -2871,7 +2870,7 @@
         </w:tc>
         <w:tc>
           <w:tcPr>
-            <w:tcW w:w="2594" w:type="dxa"/>
+            <w:tcW w:w="5089" w:type="dxa"/>
             <w:tcBorders/>
             <w:shd w:color="auto" w:fill="CCCCCC" w:val="clear"/>
           </w:tcPr>
@@ -2932,7 +2931,7 @@
         </w:trPr>
         <w:tc>
           <w:tcPr>
-            <w:tcW w:w="6748" w:type="dxa"/>
+            <w:tcW w:w="4253" w:type="dxa"/>
             <w:tcBorders/>
             <w:shd w:color="auto" w:fill="FFFFFF" w:val="clear"/>
           </w:tcPr>
@@ -2980,7 +2979,7 @@
         </w:tc>
         <w:tc>
           <w:tcPr>
-            <w:tcW w:w="2594" w:type="dxa"/>
+            <w:tcW w:w="5089" w:type="dxa"/>
             <w:tcBorders/>
             <w:shd w:color="auto" w:fill="FFFFFF" w:val="clear"/>
           </w:tcPr>
@@ -5738,6 +5737,13 @@
     <w:pPr/>
     <w:rPr/>
   </w:style>
+  <w:style w:type="paragraph" w:styleId="FrameContentsuser">
+    <w:name w:val="Frame Contents (user)"/>
+    <w:basedOn w:val="Normal"/>
+    <w:qFormat/>
+    <w:pPr/>
+    <w:rPr/>
+  </w:style>
   <w:style w:type="paragraph" w:styleId="FrameContents">
     <w:name w:val="Frame Contents"/>
     <w:basedOn w:val="Normal"/>

</xml_diff>